<commit_message>
User docs: renders and references updated for InfoDisp 1.15.2 / Annunciator 3.7.1
Regenerated the five renders the fixes change (RE-ENTRY, CIRCULARIZATION,
AIRCRAFT, ORBITAL AUTOPILOT, Annunciator SOI) and revised the references:
sky-pointer bank indicator, orbit colour rule, DROG label, chute-bar
off-scale boundaries, A/P key descent rule, CIRC estimate, Kerbol SOI and
the LIFE SUPPORT TAC-LS condition. Word versions rebuilt.

Co-Authored-By: Claude Opus 5.5 <noreply@anthropic.com>
Claude-Session: https://claude.ai/code/session_01AfFKiY5R8Xk7jem2zcWdES
</commit_message>
<xml_diff>
--- a/Documents/User/Annunciator_Caution_Warning_Reference.docx
+++ b/Documents/User/Annunciator_Caution_Warning_Reference.docx
@@ -52,7 +52,7 @@
         <w:t xml:space="preserve">Applies to:</w:t>
       </w:r>
       <w:r>
-        <w:t xml:space="preserve"> KCMk1_Annunciator firmware 3.7.0</w:t>
+        <w:t xml:space="preserve"> KCMk1_Annunciator firmware 3.7.1</w:t>
       </w:r>
     </w:p>
     <w:p>
@@ -2486,7 +2486,7 @@
                 <w:sz w:val="17"/>
                 <w:szCs w:val="17"/>
               </w:rPr>
-              <w:t xml:space="preserve"> food &lt; 24 h, water &lt; 4 h, oxygen &lt; 10 min, or any waste tank &gt; 95 % full. Worst resource wins. Crewed vessels only.</w:t>
+              <w:t xml:space="preserve"> food &lt; 24 h, water &lt; 4 h, oxygen &lt; 10 min, or any waste tank &gt; 95 % full. Worst resource wins. Crewed vessels with TAC-LS data only; without the mod the tile stays dark.</w:t>
             </w:r>
           </w:p>
         </w:tc>
@@ -10704,42 +10704,16 @@
         <w:spacing w:after="120"/>
       </w:pPr>
       <w:r>
-        <w:t xml:space="preserve">Two display quirks worth knowing:</w:t>
-      </w:r>
-    </w:p>
-    <w:p>
-      <w:pPr>
-        <w:pStyle w:val="ListParagraph"/>
-        <w:numPr>
-          <w:ilvl w:val="0"/>
-          <w:numId w:val="2"/>
-        </w:numPr>
-        <w:spacing w:after="60"/>
-      </w:pPr>
-      <w:r>
-        <w:t xml:space="preserve">The SURF. GRAVITY unit is written as m/s² in the firmware, but the panel font has no superscript-two glyph, so the screen shows "m/s".</w:t>
-      </w:r>
-    </w:p>
-    <w:p>
-      <w:pPr>
-        <w:pStyle w:val="ListParagraph"/>
-        <w:numPr>
-          <w:ilvl w:val="0"/>
-          <w:numId w:val="2"/>
-        </w:numPr>
-        <w:spacing w:after="60"/>
-      </w:pPr>
-      <w:r>
-        <w:t xml:space="preserve">For Kerbol the SOI radius is unbounded (there is no parent body), which the body table records as an infinite value. The altitude formatter cannot represent that and the row currently prints </w:t>
+        <w:t xml:space="preserve">For Kerbol the SOI radius is unbounded (there is no parent body), so its row shows </w:t>
       </w:r>
       <w:r>
         <w:rPr>
           <w:rFonts w:ascii="Consolas" w:cs="Consolas" w:eastAsia="Consolas" w:hAnsi="Consolas"/>
         </w:rPr>
-        <w:t xml:space="preserve">-9,223,372,036,854,775,808 Gm</w:t>
+        <w:t xml:space="preserve">∞</w:t>
       </w:r>
       <w:r>
-        <w:t xml:space="preserve">. The other seven Kerbol rows are correct.</w:t>
+        <w:t xml:space="preserve">.</w:t>
       </w:r>
     </w:p>
     <w:p>

</xml_diff>

<commit_message>
User docs: references for InfoDisp 1.15.3 / Annunciator 3.7.2
POWERED DESCENT SAS button, RE-ENTRY hold in the selection ladder and the
screen's own section, V.CLOSE and CLOSURE bar colours, HIGH Q on 20 kPa
dynamic pressure. The Annunciator re-entry render now lights HIGH Q, as it
should at ~185 kPa. Word versions rebuilt.

Co-Authored-By: Claude Opus 5.5 <noreply@anthropic.com>
Claude-Session: https://claude.ai/code/session_01AfFKiY5R8Xk7jem2zcWdES
</commit_message>
<xml_diff>
--- a/Documents/User/Annunciator_Caution_Warning_Reference.docx
+++ b/Documents/User/Annunciator_Caution_Warning_Reference.docx
@@ -52,7 +52,7 @@
         <w:t xml:space="preserve">Applies to:</w:t>
       </w:r>
       <w:r>
-        <w:t xml:space="preserve"> KCMk1_Annunciator firmware 3.7.1</w:t>
+        <w:t xml:space="preserve"> KCMk1_Annunciator firmware 3.7.2</w:t>
       </w:r>
     </w:p>
     <w:p>
@@ -3850,16 +3850,7 @@
                 <w:sz w:val="17"/>
                 <w:szCs w:val="17"/>
               </w:rPr>
-              <w:t xml:space="preserve"> dynamic pressure above the body's calibrated threshold. </w:t>
-            </w:r>
-            <w:r>
-              <w:rPr>
-                <w:i/>
-                <w:iCs/>
-                <w:sz w:val="17"/>
-                <w:szCs w:val="17"/>
-              </w:rPr>
-              <w:t xml:space="preserve">The threshold is currently 0 (suppressed) for every body in the shared body table, so this tile does not light until thresholds are calibrated from flight test.</w:t>
+              <w:t xml:space="preserve"> dynamic pressure q = ½ × air density × surface speed² above 20 kPa, in an atmosphere. The same limit on every body, and the level at which the Info Display's ASCENT Q readout turns yellow. A Kerbin ascent normally peaks near 10–15 kPa.</w:t>
             </w:r>
           </w:p>
         </w:tc>
@@ -18565,7 +18556,7 @@
         <w:spacing w:after="60"/>
       </w:pPr>
       <w:r>
-        <w:t xml:space="preserve">The table also holds a per-body dynamic-pressure threshold for the HIGH Q tile. It is 0 (suppressed) for all seventeen bodies at present, so it is omitted here.</w:t>
+        <w:t xml:space="preserve">The table also holds a per-body dynamic-pressure threshold field. HIGH Q no longer reads it (it uses one 20 kPa limit everywhere), so it is omitted here.</w:t>
       </w:r>
     </w:p>
     <w:p>

</xml_diff>

<commit_message>
Docs: drop the last references to the removed highQThreshold column
The Annunciator reference still described a per-body HIGH Q threshold
field in the body table, and its shared-threshold note predated the
20 kPa KCM_HIGH_Q_PA limit; the KerbalDisplayCommon README listed the
field in its BodyParams table and the Annunciator README called it
unread rather than removed (#80). All renders re-checked: every
committed image is byte-identical to a fresh render.

Co-Authored-By: Claude Opus 5.5 <noreply@anthropic.com>
Claude-Session: https://claude.ai/code/session_01AfFKiY5R8Xk7jem2zcWdES
</commit_message>
<xml_diff>
--- a/Documents/User/Annunciator_Caution_Warning_Reference.docx
+++ b/Documents/User/Annunciator_Caution_Warning_Reference.docx
@@ -18556,7 +18556,7 @@
         <w:spacing w:after="60"/>
       </w:pPr>
       <w:r>
-        <w:t xml:space="preserve">The table also holds a per-body dynamic-pressure threshold field. HIGH Q no longer reads it (it uses one 20 kPa limit everywhere), so it is omitted here.</w:t>
+        <w:t xml:space="preserve">There is no per-body HIGH Q threshold: HIGH Q uses one 20 kPa dynamic-pressure limit on every body with an atmosphere.</w:t>
       </w:r>
     </w:p>
     <w:p>
@@ -18617,7 +18617,7 @@
         <w:spacing w:after="60"/>
       </w:pPr>
       <w:r>
-        <w:t xml:space="preserve">Thresholds shared with the Info Display (ground-proximity time, g limits, low-ΔV and low-burn-time limits, chute limits) are defined once in </w:t>
+        <w:t xml:space="preserve">Thresholds shared with the Info Display (ground-proximity time, g limits, low-ΔV and low-burn-time limits, chute limits, the 20 kPa HIGH Q limit) are defined once in </w:t>
       </w:r>
       <w:r>
         <w:rPr>

</xml_diff>

<commit_message>
Stop alerting on the TAC-LS waste resources
Annunciator 3.8.2: LIFE SUPPORT assesses food, water and oxygen time
remaining only. The CO2, Waste and Waste Water fill-fraction and
time-to-full checks are removed, along with their rates, thresholds,
state fields, the TACLS_WASTE channel registration and the test-mode
setup.

Resource Display 3.14.3: the CO2, Waste and Liquid Waste meters have no
limit bands and raise no HIGH strip message. They stay high-is-bad, so
TTE reads time to full and a reserve bug trips above. Depleted Fuel
keeps its 80 / 95 % bands. alertState() now takes the bug direction
from highIsBad alone, so it holds for an unbanded waste meter.

Annunciator reference updated; renders unchanged.

Co-Authored-By: Claude Opus 5.5 <noreply@anthropic.com>
Claude-Session: https://claude.ai/code/session_01AfFKiY5R8Xk7jem2zcWdES
</commit_message>
<xml_diff>
--- a/Documents/User/Annunciator_Caution_Warning_Reference.docx
+++ b/Documents/User/Annunciator_Caution_Warning_Reference.docx
@@ -52,7 +52,7 @@
         <w:t xml:space="preserve">Applies to:</w:t>
       </w:r>
       <w:r>
-        <w:t xml:space="preserve"> KCMk1_Annunciator firmware 3.8.1</w:t>
+        <w:t xml:space="preserve"> KCMk1_Annunciator firmware 3.8.2</w:t>
       </w:r>
     </w:p>
     <w:p>
@@ -2428,7 +2428,7 @@
                 <w:sz w:val="17"/>
                 <w:szCs w:val="17"/>
               </w:rPr>
-              <w:t xml:space="preserve">Crew consumables or waste capacity at risk (TAC Life Support).</w:t>
+              <w:t xml:space="preserve">Crew consumables running out (TAC Life Support).</w:t>
             </w:r>
           </w:p>
         </w:tc>
@@ -2454,7 +2454,7 @@
                 <w:sz w:val="17"/>
                 <w:szCs w:val="17"/>
               </w:rPr>
-              <w:t xml:space="preserve">Time remaining per resource at TAC-LS default rates × crew. </w:t>
+              <w:t xml:space="preserve">Time remaining per consumable at TAC-LS default rates × crew. </w:t>
             </w:r>
             <w:r>
               <w:rPr>
@@ -2470,7 +2470,7 @@
                 <w:sz w:val="17"/>
                 <w:szCs w:val="17"/>
               </w:rPr>
-              <w:t xml:space="preserve"> food &lt; 72 h, water &lt; 12 h, oxygen &lt; 30 min, or any waste tank (CO₂, waste, waste water) &gt; 80 % full. </w:t>
+              <w:t xml:space="preserve"> food &lt; 72 h, water &lt; 12 h or oxygen &lt; 30 min. </w:t>
             </w:r>
             <w:r>
               <w:rPr>
@@ -2486,7 +2486,7 @@
                 <w:sz w:val="17"/>
                 <w:szCs w:val="17"/>
               </w:rPr>
-              <w:t xml:space="preserve"> food &lt; 24 h, water &lt; 4 h, oxygen &lt; 10 min, or any waste tank &gt; 95 % full. Worst resource wins. Crewed vessels with TAC-LS data only; without the mod the tile stays dark.</w:t>
+              <w:t xml:space="preserve"> food &lt; 24 h, water &lt; 4 h or oxygen &lt; 10 min. Worst resource wins. The waste resources (CO₂, waste, waste water) are not watched. Crewed vessels with TAC-LS data only; without the mod the tile stays dark.</w:t>
             </w:r>
           </w:p>
         </w:tc>

</xml_diff>